<commit_message>
Version2 de la guía 1
</commit_message>
<xml_diff>
--- a/GFPI-F-135 GuiadeAprendizaje -  No.1 GIT.docx
+++ b/GFPI-F-135 GuiadeAprendizaje -  No.1 GIT.docx
@@ -114,76 +114,7 @@
           <w:sz w:val="24"/>
           <w:szCs w:val="24"/>
         </w:rPr>
-        <w:t xml:space="preserve">Author: </w:t>
-      </w:r>
-      <w:r>
-        <w:rPr>
-          <w:rFonts w:cs="Calibri"/>
-          <w:b/>
-          <w:sz w:val="24"/>
-          <w:szCs w:val="24"/>
-        </w:rPr>
-        <w:t>Luis Fernando Corredor Mora</w:t>
-      </w:r>
-    </w:p>
-    <w:p>
-      <w:pPr>
-        <w:spacing w:after="0" w:line="240" w:lineRule="auto"/>
-        <w:rPr>
-          <w:rFonts w:cs="Calibri"/>
-          <w:b/>
-          <w:sz w:val="24"/>
-          <w:szCs w:val="24"/>
-        </w:rPr>
-      </w:pPr>
-      <w:r>
-        <w:rPr>
-          <w:rFonts w:cs="Calibri"/>
-          <w:b/>
-          <w:sz w:val="24"/>
-          <w:szCs w:val="24"/>
-        </w:rPr>
-        <w:t>Ingeniero de sistemas</w:t>
-      </w:r>
-    </w:p>
-    <w:p>
-      <w:pPr>
-        <w:spacing w:after="0" w:line="240" w:lineRule="auto"/>
-        <w:rPr>
-          <w:rFonts w:cs="Calibri"/>
-          <w:b/>
-          <w:sz w:val="24"/>
-          <w:szCs w:val="24"/>
-        </w:rPr>
-      </w:pPr>
-      <w:r>
-        <w:rPr>
-          <w:rFonts w:cs="Calibri"/>
-          <w:b/>
-          <w:sz w:val="24"/>
-          <w:szCs w:val="24"/>
-        </w:rPr>
-        <w:t xml:space="preserve">Fecha:  </w:t>
-      </w:r>
-      <w:proofErr w:type="gramStart"/>
-      <w:r>
-        <w:rPr>
-          <w:rFonts w:cs="Calibri"/>
-          <w:b/>
-          <w:sz w:val="24"/>
-          <w:szCs w:val="24"/>
-        </w:rPr>
-        <w:t>Junio</w:t>
-      </w:r>
-      <w:proofErr w:type="gramEnd"/>
-      <w:r>
-        <w:rPr>
-          <w:rFonts w:cs="Calibri"/>
-          <w:b/>
-          <w:sz w:val="24"/>
-          <w:szCs w:val="24"/>
-        </w:rPr>
-        <w:t xml:space="preserve"> 1 de 2026</w:t>
+        <w:t>Esta guía es para el grupo ADSI 3409633</w:t>
       </w:r>
     </w:p>
     <w:p>
@@ -16641,15 +16572,6 @@
 </file>
 
 <file path=customXml/item1.xml><?xml version="1.0" encoding="utf-8"?>
-<?mso-contentType ?>
-<FormTemplates xmlns="http://schemas.microsoft.com/sharepoint/v3/contenttype/forms">
-  <Display>DocumentLibraryForm</Display>
-  <Edit>DocumentLibraryForm</Edit>
-  <New>DocumentLibraryForm</New>
-</FormTemplates>
-</file>
-
-<file path=customXml/item2.xml><?xml version="1.0" encoding="utf-8"?>
 <ct:contentTypeSchema xmlns:ct="http://schemas.microsoft.com/office/2006/metadata/contentType" xmlns:ma="http://schemas.microsoft.com/office/2006/metadata/properties/metaAttributes" ct:_="" ma:_="" ma:contentTypeName="Document" ma:contentTypeID="0x010100E6FB40559C53924D9947EEC60714F600" ma:contentTypeVersion="14" ma:contentTypeDescription="Create a new document." ma:contentTypeScope="" ma:versionID="cb94d2a05574536df82d0c972c1ab7f6">
   <xsd:schema xmlns:xsd="http://www.w3.org/2001/XMLSchema" xmlns:xs="http://www.w3.org/2001/XMLSchema" xmlns:p="http://schemas.microsoft.com/office/2006/metadata/properties" xmlns:ns2="932546ec-9fd3-4385-85aa-a79281ebb4c5" xmlns:ns3="3b6d2153-ea30-4986-ad45-11d5a60cf126" targetNamespace="http://schemas.microsoft.com/office/2006/metadata/properties" ma:root="true" ma:fieldsID="0dac74d9b28dc37fa479047abd5a0322" ns2:_="" ns3:_="">
     <xsd:import namespace="932546ec-9fd3-4385-85aa-a79281ebb4c5"/>
@@ -16878,7 +16800,20 @@
 </ct:contentTypeSchema>
 </file>
 
+<file path=customXml/item2.xml><?xml version="1.0" encoding="utf-8"?>
+<?mso-contentType ?>
+<FormTemplates xmlns="http://schemas.microsoft.com/sharepoint/v3/contenttype/forms">
+  <Display>DocumentLibraryForm</Display>
+  <Edit>DocumentLibraryForm</Edit>
+  <New>DocumentLibraryForm</New>
+</FormTemplates>
+</file>
+
 <file path=customXml/item3.xml><?xml version="1.0" encoding="utf-8"?>
+<b:Sources xmlns:b="http://schemas.openxmlformats.org/officeDocument/2006/bibliography" xmlns="http://schemas.openxmlformats.org/officeDocument/2006/bibliography" SelectedStyle="/APA.XSL" StyleName="APA"/>
+</file>
+
+<file path=customXml/item4.xml><?xml version="1.0" encoding="utf-8"?>
 <p:properties xmlns:p="http://schemas.microsoft.com/office/2006/metadata/properties" xmlns:xsi="http://www.w3.org/2001/XMLSchema-instance" xmlns:pc="http://schemas.microsoft.com/office/infopath/2007/PartnerControls">
   <documentManagement>
     <lcf76f155ced4ddcb4097134ff3c332f xmlns="932546ec-9fd3-4385-85aa-a79281ebb4c5">
@@ -16889,19 +16824,7 @@
 </p:properties>
 </file>
 
-<file path=customXml/item4.xml><?xml version="1.0" encoding="utf-8"?>
-<b:Sources xmlns:b="http://schemas.openxmlformats.org/officeDocument/2006/bibliography" xmlns="http://schemas.openxmlformats.org/officeDocument/2006/bibliography" SelectedStyle="/APA.XSL" StyleName="APA"/>
-</file>
-
 <file path=customXml/itemProps1.xml><?xml version="1.0" encoding="utf-8"?>
-<ds:datastoreItem xmlns:ds="http://schemas.openxmlformats.org/officeDocument/2006/customXml" ds:itemID="{3F9D943A-8F73-4333-9169-A981417CD6FA}">
-  <ds:schemaRefs>
-    <ds:schemaRef ds:uri="http://schemas.microsoft.com/sharepoint/v3/contenttype/forms"/>
-  </ds:schemaRefs>
-</ds:datastoreItem>
-</file>
-
-<file path=customXml/itemProps2.xml><?xml version="1.0" encoding="utf-8"?>
 <ds:datastoreItem xmlns:ds="http://schemas.openxmlformats.org/officeDocument/2006/customXml" ds:itemID="{3B1041A2-1341-4421-B5F5-50CA599F65C6}">
   <ds:schemaRefs>
     <ds:schemaRef ds:uri="http://schemas.microsoft.com/office/2006/metadata/contentType"/>
@@ -16920,7 +16843,23 @@
 </ds:datastoreItem>
 </file>
 
+<file path=customXml/itemProps2.xml><?xml version="1.0" encoding="utf-8"?>
+<ds:datastoreItem xmlns:ds="http://schemas.openxmlformats.org/officeDocument/2006/customXml" ds:itemID="{3F9D943A-8F73-4333-9169-A981417CD6FA}">
+  <ds:schemaRefs>
+    <ds:schemaRef ds:uri="http://schemas.microsoft.com/sharepoint/v3/contenttype/forms"/>
+  </ds:schemaRefs>
+</ds:datastoreItem>
+</file>
+
 <file path=customXml/itemProps3.xml><?xml version="1.0" encoding="utf-8"?>
+<ds:datastoreItem xmlns:ds="http://schemas.openxmlformats.org/officeDocument/2006/customXml" ds:itemID="{8F77DE2A-42C6-4CA6-9039-80EF84878373}">
+  <ds:schemaRefs>
+    <ds:schemaRef ds:uri="http://schemas.openxmlformats.org/officeDocument/2006/bibliography"/>
+  </ds:schemaRefs>
+</ds:datastoreItem>
+</file>
+
+<file path=customXml/itemProps4.xml><?xml version="1.0" encoding="utf-8"?>
 <ds:datastoreItem xmlns:ds="http://schemas.openxmlformats.org/officeDocument/2006/customXml" ds:itemID="{148CFCA9-C04F-4472-9ACE-2C2B0713CCB5}">
   <ds:schemaRefs>
     <ds:schemaRef ds:uri="http://schemas.microsoft.com/office/2006/metadata/properties"/>
@@ -16929,12 +16868,4 @@
     <ds:schemaRef ds:uri="3b6d2153-ea30-4986-ad45-11d5a60cf126"/>
   </ds:schemaRefs>
 </ds:datastoreItem>
-</file>
-
-<file path=customXml/itemProps4.xml><?xml version="1.0" encoding="utf-8"?>
-<ds:datastoreItem xmlns:ds="http://schemas.openxmlformats.org/officeDocument/2006/customXml" ds:itemID="{8F77DE2A-42C6-4CA6-9039-80EF84878373}">
-  <ds:schemaRefs>
-    <ds:schemaRef ds:uri="http://schemas.openxmlformats.org/officeDocument/2006/bibliography"/>
-  </ds:schemaRefs>
-</ds:datastoreItem>
 </file>
</xml_diff>